<commit_message>
Polish final portfolio documents
</commit_message>
<xml_diff>
--- a/docs/artifacts/professional-self-assessment.docx
+++ b/docs/artifacts/professional-self-assessment.docx
@@ -8,7 +8,7 @@
         <w:jc w:val="center"/>
       </w:pPr>
       <w:r>
-        <w:t>Professional Self Assessment</w:t>
+        <w:t>Professional Self-Assessment</w:t>
       </w:r>
     </w:p>
     <w:p>
@@ -25,6 +25,14 @@
       </w:pPr>
       <w:r>
         <w:t>Southern New Hampshire University | CS 499</w:t>
+      </w:r>
+    </w:p>
+    <w:p>
+      <w:pPr>
+        <w:jc w:val="center"/>
+      </w:pPr>
+      <w:r>
+        <w:t>October 13, 2026</w:t>
       </w:r>
     </w:p>
     <w:p>

</xml_diff>